<commit_message>
Complete cinematic portfolio rebuild with Vite/React
</commit_message>
<xml_diff>
--- a/Tanima_Garg_RESUME.docx
+++ b/Tanima_Garg_RESUME.docx
@@ -203,8 +203,53 @@
           <w:sz w:val="18"/>
           <w:szCs w:val="18"/>
         </w:rPr>
-        <w:t xml:space="preserve"> (Hybrid)  </w:t>
-      </w:r>
+        <w:t xml:space="preserve"> (Hybrid)</w:t>
+      </w:r>
+      <w:r>
+        <w:rPr>
+          <w:rFonts w:ascii="Tahoma" w:hAnsi="Tahoma" w:cs="Tahoma"/>
+          <w:sz w:val="18"/>
+          <w:szCs w:val="18"/>
+        </w:rPr>
+        <w:t xml:space="preserve"> |</w:t>
+      </w:r>
+      <w:r>
+        <w:rPr>
+          <w:rFonts w:ascii="Tahoma" w:hAnsi="Tahoma" w:cs="Tahoma"/>
+          <w:sz w:val="18"/>
+          <w:szCs w:val="18"/>
+        </w:rPr>
+        <w:t xml:space="preserve"> </w:t>
+      </w:r>
+      <w:hyperlink r:id="rId9" w:history="1">
+        <w:r>
+          <w:rPr>
+            <w:rStyle w:val="Hyperlink"/>
+            <w:rFonts w:ascii="Tahoma" w:hAnsi="Tahoma" w:cs="Tahoma"/>
+            <w:sz w:val="18"/>
+            <w:szCs w:val="18"/>
+          </w:rPr>
+          <w:t>Portf</w:t>
+        </w:r>
+        <w:r>
+          <w:rPr>
+            <w:rStyle w:val="Hyperlink"/>
+            <w:rFonts w:ascii="Tahoma" w:hAnsi="Tahoma" w:cs="Tahoma"/>
+            <w:sz w:val="18"/>
+            <w:szCs w:val="18"/>
+          </w:rPr>
+          <w:t>o</w:t>
+        </w:r>
+        <w:r>
+          <w:rPr>
+            <w:rStyle w:val="Hyperlink"/>
+            <w:rFonts w:ascii="Tahoma" w:hAnsi="Tahoma" w:cs="Tahoma"/>
+            <w:sz w:val="18"/>
+            <w:szCs w:val="18"/>
+          </w:rPr>
+          <w:t>lio</w:t>
+        </w:r>
+      </w:hyperlink>
     </w:p>
     <w:p>
       <w:pPr>
@@ -2076,7 +2121,7 @@
         </w:rPr>
         <w:t xml:space="preserve"> </w:t>
       </w:r>
-      <w:hyperlink r:id="rId9" w:history="1">
+      <w:hyperlink r:id="rId10" w:history="1">
         <w:r>
           <w:rPr>
             <w:rStyle w:val="Hyperlink"/>
@@ -2367,7 +2412,7 @@
         </w:rPr>
         <w:t xml:space="preserve">                                                                                                                                       </w:t>
       </w:r>
-      <w:hyperlink r:id="rId10" w:history="1">
+      <w:hyperlink r:id="rId11" w:history="1">
         <w:r>
           <w:rPr>
             <w:rStyle w:val="Hyperlink"/>
@@ -2655,7 +2700,7 @@
           <w:szCs w:val="18"/>
         </w:rPr>
         <w:sectPr>
-          <w:headerReference w:type="default" r:id="rId11"/>
+          <w:headerReference w:type="default" r:id="rId12"/>
           <w:pgSz w:w="12240" w:h="15840"/>
           <w:pgMar w:top="510" w:right="284" w:bottom="284" w:left="454" w:header="709" w:footer="709" w:gutter="0"/>
           <w:cols w:space="708"/>

</xml_diff>